<commit_message>
fix: add extra filter for toxins stopwords
</commit_message>
<xml_diff>
--- a/src/assets/report/relatorio_bienestar.docx
+++ b/src/assets/report/relatorio_bienestar.docx
@@ -119,7 +119,31 @@
           <w:szCs w:val="32"/>
           <w:lang w:val="pt-BR"/>
         </w:rPr>
-        <w:t>{name}}</w:t>
+        <w:t>{</w:t>
+      </w:r>
+      <w:proofErr w:type="spellStart"/>
+      <w:r>
+        <w:rPr>
+          <w:rFonts w:ascii="Calibri" w:eastAsia="Calibri" w:hAnsi="Calibri" w:cs="Calibri"/>
+          <w:b/>
+          <w:bCs/>
+          <w:sz w:val="32"/>
+          <w:szCs w:val="32"/>
+          <w:lang w:val="pt-BR"/>
+        </w:rPr>
+        <w:t>name</w:t>
+      </w:r>
+      <w:proofErr w:type="spellEnd"/>
+      <w:r>
+        <w:rPr>
+          <w:rFonts w:ascii="Calibri" w:eastAsia="Calibri" w:hAnsi="Calibri" w:cs="Calibri"/>
+          <w:b/>
+          <w:bCs/>
+          <w:sz w:val="32"/>
+          <w:szCs w:val="32"/>
+          <w:lang w:val="pt-BR"/>
+        </w:rPr>
+        <w:t>}}</w:t>
       </w:r>
     </w:p>
     <w:p>
@@ -173,7 +197,23 @@
           <w:rFonts w:ascii="Calibri" w:eastAsia="Calibri" w:hAnsi="Calibri" w:cs="Calibri"/>
           <w:lang w:val="pt-BR"/>
         </w:rPr>
-        <w:t xml:space="preserve">A biorressonância é uma avaliação funcional e complementar que observa padrões de resposta do organismo a diferentes estímulos. Ela não substitui diagnósticos médicos, mas auxilia na identificação de tendências de sobrecarga ou equilíbrio no funcionamento do corpo. </w:t>
+        <w:t xml:space="preserve">A </w:t>
+      </w:r>
+      <w:proofErr w:type="spellStart"/>
+      <w:r>
+        <w:rPr>
+          <w:rFonts w:ascii="Calibri" w:eastAsia="Calibri" w:hAnsi="Calibri" w:cs="Calibri"/>
+          <w:lang w:val="pt-BR"/>
+        </w:rPr>
+        <w:t>biorressonância</w:t>
+      </w:r>
+      <w:proofErr w:type="spellEnd"/>
+      <w:r>
+        <w:rPr>
+          <w:rFonts w:ascii="Calibri" w:eastAsia="Calibri" w:hAnsi="Calibri" w:cs="Calibri"/>
+          <w:lang w:val="pt-BR"/>
+        </w:rPr>
+        <w:t xml:space="preserve"> é uma avaliação funcional e complementar que observa padrões de resposta do organismo a diferentes estímulos. Ela não substitui diagnósticos médicos, mas auxilia na identificação de tendências de sobrecarga ou equilíbrio no funcionamento do corpo. </w:t>
       </w:r>
     </w:p>
     <w:p>
@@ -244,12 +284,21 @@
         </w:rPr>
         <w:t xml:space="preserve">2.2. Microrganismos </w:t>
       </w:r>
+      <w:proofErr w:type="gramStart"/>
       <w:r>
         <w:rPr>
           <w:rFonts w:ascii="Calibri" w:eastAsia="Calibri" w:hAnsi="Calibri" w:cs="Calibri"/>
           <w:lang w:val="pt-BR"/>
         </w:rPr>
-        <w:t>-  identifica vírus, bactérias, helmintos e protozoários que podem estar afetando o organismo, mas a manifestação varia conforme as particularidades fisiológicas e energéticas individuais, pois podem resultar da combinação sinérgica de cada microrganismo com toxinas e até mesmo com fatores psicoemocionais.</w:t>
+        <w:t>-  identifica</w:t>
+      </w:r>
+      <w:proofErr w:type="gramEnd"/>
+      <w:r>
+        <w:rPr>
+          <w:rFonts w:ascii="Calibri" w:eastAsia="Calibri" w:hAnsi="Calibri" w:cs="Calibri"/>
+          <w:lang w:val="pt-BR"/>
+        </w:rPr>
+        <w:t xml:space="preserve"> vírus, bactérias, helmintos e protozoários que podem estar afetando o organismo, mas a manifestação varia conforme as particularidades fisiológicas e energéticas individuais, pois podem resultar da combinação sinérgica de cada microrganismo com toxinas e até mesmo com fatores psicoemocionais.</w:t>
       </w:r>
     </w:p>
     <w:p>
@@ -276,7 +325,23 @@
           <w:rFonts w:ascii="Calibri" w:eastAsia="Calibri" w:hAnsi="Calibri" w:cs="Calibri"/>
           <w:lang w:val="pt-BR"/>
         </w:rPr>
-        <w:t>identifica metais pesados, solventes, agrotóxicos, xenoestrógenos, radiação, além de toxinas ambientais, alimentares, intestinais, nervosas e farmacológicas. Tais substâncias contribuem para o aumento do estresse oxidativo, desestabilização metabólica e redução da eficiência imunológica, bem como alteram o pH dos tecidos e favorecem a disbiose, facilitando a proliferação de microrganismos oportunistas.</w:t>
+        <w:t xml:space="preserve">identifica metais pesados, solventes, agrotóxicos, </w:t>
+      </w:r>
+      <w:proofErr w:type="spellStart"/>
+      <w:r>
+        <w:rPr>
+          <w:rFonts w:ascii="Calibri" w:eastAsia="Calibri" w:hAnsi="Calibri" w:cs="Calibri"/>
+          <w:lang w:val="pt-BR"/>
+        </w:rPr>
+        <w:t>xenoestrógenos</w:t>
+      </w:r>
+      <w:proofErr w:type="spellEnd"/>
+      <w:r>
+        <w:rPr>
+          <w:rFonts w:ascii="Calibri" w:eastAsia="Calibri" w:hAnsi="Calibri" w:cs="Calibri"/>
+          <w:lang w:val="pt-BR"/>
+        </w:rPr>
+        <w:t>, radiação, além de toxinas ambientais, alimentares, intestinais, nervosas e farmacológicas. Tais substâncias contribuem para o aumento do estresse oxidativo, desestabilização metabólica e redução da eficiência imunológica, bem como alteram o pH dos tecidos e favorecem a disbiose, facilitando a proliferação de microrganismos oportunistas.</w:t>
       </w:r>
     </w:p>
     <w:p>
@@ -296,7 +361,27 @@
           <w:bCs/>
           <w:lang w:val="pt-BR"/>
         </w:rPr>
-        <w:t xml:space="preserve">2.4. Campo morfogenético - </w:t>
+        <w:t xml:space="preserve">2.4. Campo </w:t>
+      </w:r>
+      <w:proofErr w:type="spellStart"/>
+      <w:r>
+        <w:rPr>
+          <w:rFonts w:ascii="Calibri" w:eastAsia="Calibri" w:hAnsi="Calibri" w:cs="Calibri"/>
+          <w:b/>
+          <w:bCs/>
+          <w:lang w:val="pt-BR"/>
+        </w:rPr>
+        <w:t>morfogenético</w:t>
+      </w:r>
+      <w:proofErr w:type="spellEnd"/>
+      <w:r>
+        <w:rPr>
+          <w:rFonts w:ascii="Calibri" w:eastAsia="Calibri" w:hAnsi="Calibri" w:cs="Calibri"/>
+          <w:b/>
+          <w:bCs/>
+          <w:lang w:val="pt-BR"/>
+        </w:rPr>
+        <w:t xml:space="preserve"> - </w:t>
       </w:r>
       <w:r>
         <w:rPr>
@@ -377,7 +462,27 @@
           <w:bCs/>
           <w:lang w:val="pt-BR"/>
         </w:rPr>
-        <w:t>3. INTERPRETAÇÃO DOS  RESULTADOS DAS ANÁLISES</w:t>
+        <w:t xml:space="preserve">3. INTERPRETAÇÃO </w:t>
+      </w:r>
+      <w:proofErr w:type="gramStart"/>
+      <w:r>
+        <w:rPr>
+          <w:rFonts w:ascii="Calibri" w:eastAsia="Calibri" w:hAnsi="Calibri" w:cs="Calibri"/>
+          <w:b/>
+          <w:bCs/>
+          <w:lang w:val="pt-BR"/>
+        </w:rPr>
+        <w:t>DOS  RESULTADOS</w:t>
+      </w:r>
+      <w:proofErr w:type="gramEnd"/>
+      <w:r>
+        <w:rPr>
+          <w:rFonts w:ascii="Calibri" w:eastAsia="Calibri" w:hAnsi="Calibri" w:cs="Calibri"/>
+          <w:b/>
+          <w:bCs/>
+          <w:lang w:val="pt-BR"/>
+        </w:rPr>
+        <w:t xml:space="preserve"> DAS ANÁLISES</w:t>
       </w:r>
     </w:p>
     <w:p>
@@ -419,8 +524,19 @@
           <w:bCs/>
           <w:lang w:val="pt-BR"/>
         </w:rPr>
-        <w:t>No sistema ProSync</w:t>
+        <w:t xml:space="preserve">No sistema </w:t>
       </w:r>
+      <w:proofErr w:type="spellStart"/>
+      <w:r>
+        <w:rPr>
+          <w:rFonts w:ascii="Calibri" w:eastAsia="Calibri" w:hAnsi="Calibri" w:cs="Calibri"/>
+          <w:b/>
+          <w:bCs/>
+          <w:lang w:val="pt-BR"/>
+        </w:rPr>
+        <w:t>ProSync</w:t>
+      </w:r>
+      <w:proofErr w:type="spellEnd"/>
       <w:r>
         <w:rPr>
           <w:rFonts w:ascii="Calibri" w:eastAsia="Calibri" w:hAnsi="Calibri" w:cs="Calibri"/>
@@ -497,6 +613,7 @@
                 <w:rFonts w:ascii="Calibri" w:eastAsia="Calibri" w:hAnsi="Calibri" w:cs="Calibri"/>
               </w:rPr>
             </w:pPr>
+            <w:proofErr w:type="spellStart"/>
             <w:r>
               <w:rPr>
                 <w:rFonts w:ascii="Calibri" w:eastAsia="Calibri" w:hAnsi="Calibri" w:cs="Calibri"/>
@@ -504,6 +621,7 @@
               <w:lastRenderedPageBreak/>
               <w:t>Aspectos</w:t>
             </w:r>
+            <w:proofErr w:type="spellEnd"/>
           </w:p>
         </w:tc>
         <w:tc>
@@ -552,12 +670,14 @@
                 <w:rFonts w:ascii="Calibri" w:eastAsia="Calibri" w:hAnsi="Calibri" w:cs="Calibri"/>
               </w:rPr>
             </w:pPr>
+            <w:proofErr w:type="spellStart"/>
             <w:r>
               <w:rPr>
                 <w:rFonts w:ascii="Calibri" w:eastAsia="Calibri" w:hAnsi="Calibri" w:cs="Calibri"/>
               </w:rPr>
               <w:t>Interpretação</w:t>
             </w:r>
+            <w:proofErr w:type="spellEnd"/>
           </w:p>
         </w:tc>
       </w:tr>
@@ -578,6 +698,7 @@
                 <w:szCs w:val="20"/>
               </w:rPr>
             </w:pPr>
+            <w:proofErr w:type="spellStart"/>
             <w:r>
               <w:rPr>
                 <w:rFonts w:ascii="Calibri" w:eastAsia="Calibri" w:hAnsi="Calibri" w:cs="Calibri"/>
@@ -586,6 +707,7 @@
               </w:rPr>
               <w:t>Microrganismos</w:t>
             </w:r>
+            <w:proofErr w:type="spellEnd"/>
           </w:p>
         </w:tc>
         <w:tc>
@@ -866,6 +988,7 @@
                 <w:szCs w:val="20"/>
               </w:rPr>
             </w:pPr>
+            <w:proofErr w:type="spellStart"/>
             <w:r>
               <w:rPr>
                 <w:rFonts w:ascii="Calibri" w:eastAsia="Calibri" w:hAnsi="Calibri" w:cs="Calibri"/>
@@ -874,6 +997,7 @@
               </w:rPr>
               <w:t>Toxinas</w:t>
             </w:r>
+            <w:proofErr w:type="spellEnd"/>
           </w:p>
         </w:tc>
         <w:tc>
@@ -1225,13 +1349,41 @@
               </w:rPr>
               <w:t xml:space="preserve">Não ressoa com o organismo. </w:t>
             </w:r>
+            <w:proofErr w:type="spellStart"/>
             <w:r>
               <w:rPr>
                 <w:rFonts w:ascii="Calibri" w:eastAsia="Calibri" w:hAnsi="Calibri" w:cs="Calibri"/>
                 <w:sz w:val="20"/>
                 <w:szCs w:val="20"/>
               </w:rPr>
-              <w:t>Ausência de carga tóxica.</w:t>
+              <w:t>Ausência</w:t>
+            </w:r>
+            <w:proofErr w:type="spellEnd"/>
+            <w:r>
+              <w:rPr>
+                <w:rFonts w:ascii="Calibri" w:eastAsia="Calibri" w:hAnsi="Calibri" w:cs="Calibri"/>
+                <w:sz w:val="20"/>
+                <w:szCs w:val="20"/>
+              </w:rPr>
+              <w:t xml:space="preserve"> de carga </w:t>
+            </w:r>
+            <w:proofErr w:type="spellStart"/>
+            <w:r>
+              <w:rPr>
+                <w:rFonts w:ascii="Calibri" w:eastAsia="Calibri" w:hAnsi="Calibri" w:cs="Calibri"/>
+                <w:sz w:val="20"/>
+                <w:szCs w:val="20"/>
+              </w:rPr>
+              <w:t>tóxica</w:t>
+            </w:r>
+            <w:proofErr w:type="spellEnd"/>
+            <w:r>
+              <w:rPr>
+                <w:rFonts w:ascii="Calibri" w:eastAsia="Calibri" w:hAnsi="Calibri" w:cs="Calibri"/>
+                <w:sz w:val="20"/>
+                <w:szCs w:val="20"/>
+              </w:rPr>
+              <w:t>.</w:t>
             </w:r>
           </w:p>
         </w:tc>
@@ -1270,8 +1422,18 @@
                 <w:sz w:val="20"/>
                 <w:szCs w:val="20"/>
               </w:rPr>
-              <w:t>Campo morfogenético</w:t>
-            </w:r>
+              <w:t xml:space="preserve">Campo </w:t>
+            </w:r>
+            <w:proofErr w:type="spellStart"/>
+            <w:r>
+              <w:rPr>
+                <w:rFonts w:ascii="Calibri" w:eastAsia="Calibri" w:hAnsi="Calibri" w:cs="Calibri"/>
+                <w:sz w:val="20"/>
+                <w:szCs w:val="20"/>
+              </w:rPr>
+              <w:t>morfogenético</w:t>
+            </w:r>
+            <w:proofErr w:type="spellEnd"/>
           </w:p>
         </w:tc>
         <w:tc>
@@ -1333,7 +1495,27 @@
                 <w:szCs w:val="20"/>
                 <w:lang w:val="pt-BR"/>
               </w:rPr>
-              <w:t>Emoção ativa e ressoante que está afetando os campos  emocional/mental no momento.</w:t>
+              <w:t xml:space="preserve">Emoção ativa e ressoante que está afetando os </w:t>
+            </w:r>
+            <w:proofErr w:type="gramStart"/>
+            <w:r>
+              <w:rPr>
+                <w:rFonts w:ascii="Calibri" w:eastAsia="Calibri" w:hAnsi="Calibri" w:cs="Calibri"/>
+                <w:sz w:val="20"/>
+                <w:szCs w:val="20"/>
+                <w:lang w:val="pt-BR"/>
+              </w:rPr>
+              <w:t>campos  emocional</w:t>
+            </w:r>
+            <w:proofErr w:type="gramEnd"/>
+            <w:r>
+              <w:rPr>
+                <w:rFonts w:ascii="Calibri" w:eastAsia="Calibri" w:hAnsi="Calibri" w:cs="Calibri"/>
+                <w:sz w:val="20"/>
+                <w:szCs w:val="20"/>
+                <w:lang w:val="pt-BR"/>
+              </w:rPr>
+              <w:t>/mental no momento.</w:t>
             </w:r>
           </w:p>
         </w:tc>
@@ -1434,7 +1616,115 @@
                 <w:sz w:val="20"/>
                 <w:szCs w:val="20"/>
               </w:rPr>
-              <w:t>Pode estar ligada a memórias ou padrões recorrentes.</w:t>
+              <w:t xml:space="preserve">Pode </w:t>
+            </w:r>
+            <w:proofErr w:type="spellStart"/>
+            <w:r>
+              <w:rPr>
+                <w:rFonts w:ascii="Calibri" w:eastAsia="Calibri" w:hAnsi="Calibri" w:cs="Calibri"/>
+                <w:sz w:val="20"/>
+                <w:szCs w:val="20"/>
+              </w:rPr>
+              <w:t>estar</w:t>
+            </w:r>
+            <w:proofErr w:type="spellEnd"/>
+            <w:r>
+              <w:rPr>
+                <w:rFonts w:ascii="Calibri" w:eastAsia="Calibri" w:hAnsi="Calibri" w:cs="Calibri"/>
+                <w:sz w:val="20"/>
+                <w:szCs w:val="20"/>
+              </w:rPr>
+              <w:t xml:space="preserve"> </w:t>
+            </w:r>
+            <w:proofErr w:type="spellStart"/>
+            <w:r>
+              <w:rPr>
+                <w:rFonts w:ascii="Calibri" w:eastAsia="Calibri" w:hAnsi="Calibri" w:cs="Calibri"/>
+                <w:sz w:val="20"/>
+                <w:szCs w:val="20"/>
+              </w:rPr>
+              <w:t>ligada</w:t>
+            </w:r>
+            <w:proofErr w:type="spellEnd"/>
+            <w:r>
+              <w:rPr>
+                <w:rFonts w:ascii="Calibri" w:eastAsia="Calibri" w:hAnsi="Calibri" w:cs="Calibri"/>
+                <w:sz w:val="20"/>
+                <w:szCs w:val="20"/>
+              </w:rPr>
+              <w:t xml:space="preserve"> a </w:t>
+            </w:r>
+            <w:proofErr w:type="spellStart"/>
+            <w:r>
+              <w:rPr>
+                <w:rFonts w:ascii="Calibri" w:eastAsia="Calibri" w:hAnsi="Calibri" w:cs="Calibri"/>
+                <w:sz w:val="20"/>
+                <w:szCs w:val="20"/>
+              </w:rPr>
+              <w:t>memórias</w:t>
+            </w:r>
+            <w:proofErr w:type="spellEnd"/>
+            <w:r>
+              <w:rPr>
+                <w:rFonts w:ascii="Calibri" w:eastAsia="Calibri" w:hAnsi="Calibri" w:cs="Calibri"/>
+                <w:sz w:val="20"/>
+                <w:szCs w:val="20"/>
+              </w:rPr>
+              <w:t xml:space="preserve"> </w:t>
+            </w:r>
+            <w:proofErr w:type="spellStart"/>
+            <w:r>
+              <w:rPr>
+                <w:rFonts w:ascii="Calibri" w:eastAsia="Calibri" w:hAnsi="Calibri" w:cs="Calibri"/>
+                <w:sz w:val="20"/>
+                <w:szCs w:val="20"/>
+              </w:rPr>
+              <w:t>ou</w:t>
+            </w:r>
+            <w:proofErr w:type="spellEnd"/>
+            <w:r>
+              <w:rPr>
+                <w:rFonts w:ascii="Calibri" w:eastAsia="Calibri" w:hAnsi="Calibri" w:cs="Calibri"/>
+                <w:sz w:val="20"/>
+                <w:szCs w:val="20"/>
+              </w:rPr>
+              <w:t xml:space="preserve"> </w:t>
+            </w:r>
+            <w:proofErr w:type="spellStart"/>
+            <w:r>
+              <w:rPr>
+                <w:rFonts w:ascii="Calibri" w:eastAsia="Calibri" w:hAnsi="Calibri" w:cs="Calibri"/>
+                <w:sz w:val="20"/>
+                <w:szCs w:val="20"/>
+              </w:rPr>
+              <w:t>padrões</w:t>
+            </w:r>
+            <w:proofErr w:type="spellEnd"/>
+            <w:r>
+              <w:rPr>
+                <w:rFonts w:ascii="Calibri" w:eastAsia="Calibri" w:hAnsi="Calibri" w:cs="Calibri"/>
+                <w:sz w:val="20"/>
+                <w:szCs w:val="20"/>
+              </w:rPr>
+              <w:t xml:space="preserve"> </w:t>
+            </w:r>
+            <w:proofErr w:type="spellStart"/>
+            <w:r>
+              <w:rPr>
+                <w:rFonts w:ascii="Calibri" w:eastAsia="Calibri" w:hAnsi="Calibri" w:cs="Calibri"/>
+                <w:sz w:val="20"/>
+                <w:szCs w:val="20"/>
+              </w:rPr>
+              <w:t>recorrentes</w:t>
+            </w:r>
+            <w:proofErr w:type="spellEnd"/>
+            <w:r>
+              <w:rPr>
+                <w:rFonts w:ascii="Calibri" w:eastAsia="Calibri" w:hAnsi="Calibri" w:cs="Calibri"/>
+                <w:sz w:val="20"/>
+                <w:szCs w:val="20"/>
+              </w:rPr>
+              <w:t>.</w:t>
             </w:r>
           </w:p>
         </w:tc>
@@ -2044,6 +2334,7 @@
                 <w:szCs w:val="20"/>
               </w:rPr>
             </w:pPr>
+            <w:proofErr w:type="spellStart"/>
             <w:r>
               <w:rPr>
                 <w:rFonts w:ascii="Calibri" w:eastAsia="Calibri" w:hAnsi="Calibri" w:cs="Calibri"/>
@@ -2052,6 +2343,7 @@
               </w:rPr>
               <w:t>Patologias</w:t>
             </w:r>
+            <w:proofErr w:type="spellEnd"/>
           </w:p>
         </w:tc>
         <w:tc>
@@ -2321,14 +2613,34 @@
                 <w:szCs w:val="20"/>
               </w:rPr>
             </w:pPr>
+            <w:proofErr w:type="spellStart"/>
             <w:r>
               <w:rPr>
                 <w:rFonts w:ascii="Calibri" w:eastAsia="Calibri" w:hAnsi="Calibri" w:cs="Calibri"/>
                 <w:sz w:val="20"/>
                 <w:szCs w:val="20"/>
               </w:rPr>
-              <w:t>Pedras/Cristais</w:t>
-            </w:r>
+              <w:t>Pedras</w:t>
+            </w:r>
+            <w:proofErr w:type="spellEnd"/>
+            <w:r>
+              <w:rPr>
+                <w:rFonts w:ascii="Calibri" w:eastAsia="Calibri" w:hAnsi="Calibri" w:cs="Calibri"/>
+                <w:sz w:val="20"/>
+                <w:szCs w:val="20"/>
+              </w:rPr>
+              <w:t>/</w:t>
+            </w:r>
+            <w:proofErr w:type="spellStart"/>
+            <w:r>
+              <w:rPr>
+                <w:rFonts w:ascii="Calibri" w:eastAsia="Calibri" w:hAnsi="Calibri" w:cs="Calibri"/>
+                <w:sz w:val="20"/>
+                <w:szCs w:val="20"/>
+              </w:rPr>
+              <w:t>Cristais</w:t>
+            </w:r>
+            <w:proofErr w:type="spellEnd"/>
           </w:p>
         </w:tc>
         <w:tc>
@@ -2384,29 +2696,32 @@
                 <w:szCs w:val="20"/>
               </w:rPr>
             </w:pPr>
+            <w:proofErr w:type="spellStart"/>
             <w:r>
               <w:rPr>
                 <w:rFonts w:ascii="Calibri" w:eastAsia="Calibri" w:hAnsi="Calibri" w:cs="Calibri"/>
                 <w:sz w:val="20"/>
                 <w:szCs w:val="20"/>
               </w:rPr>
-              <w:t>Altamente benéfic</w:t>
-            </w:r>
+              <w:t>Altamente</w:t>
+            </w:r>
+            <w:proofErr w:type="spellEnd"/>
             <w:r>
               <w:rPr>
                 <w:rFonts w:ascii="Calibri" w:eastAsia="Calibri" w:hAnsi="Calibri" w:cs="Calibri"/>
                 <w:sz w:val="20"/>
                 <w:szCs w:val="20"/>
               </w:rPr>
-              <w:t>a</w:t>
-            </w:r>
+              <w:t xml:space="preserve"> </w:t>
+            </w:r>
+            <w:proofErr w:type="spellStart"/>
             <w:r>
               <w:rPr>
                 <w:rFonts w:ascii="Calibri" w:eastAsia="Calibri" w:hAnsi="Calibri" w:cs="Calibri"/>
                 <w:sz w:val="20"/>
                 <w:szCs w:val="20"/>
               </w:rPr>
-              <w:t>, tanto</w:t>
+              <w:t>benéfic</w:t>
             </w:r>
             <w:r>
               <w:rPr>
@@ -2414,15 +2729,16 @@
                 <w:sz w:val="20"/>
                 <w:szCs w:val="20"/>
               </w:rPr>
-              <w:t xml:space="preserve"> no aspecto </w:t>
-            </w:r>
+              <w:t>a</w:t>
+            </w:r>
+            <w:proofErr w:type="spellEnd"/>
             <w:r>
               <w:rPr>
                 <w:rFonts w:ascii="Calibri" w:eastAsia="Calibri" w:hAnsi="Calibri" w:cs="Calibri"/>
                 <w:sz w:val="20"/>
                 <w:szCs w:val="20"/>
               </w:rPr>
-              <w:t>fís</w:t>
+              <w:t>, tanto</w:t>
             </w:r>
             <w:r>
               <w:rPr>
@@ -2430,31 +2746,111 @@
                 <w:sz w:val="20"/>
                 <w:szCs w:val="20"/>
               </w:rPr>
-              <w:t>i</w:t>
-            </w:r>
+              <w:t xml:space="preserve"> no </w:t>
+            </w:r>
+            <w:proofErr w:type="spellStart"/>
             <w:r>
               <w:rPr>
                 <w:rFonts w:ascii="Calibri" w:eastAsia="Calibri" w:hAnsi="Calibri" w:cs="Calibri"/>
                 <w:sz w:val="20"/>
                 <w:szCs w:val="20"/>
               </w:rPr>
-              <w:t xml:space="preserve">co como </w:t>
-            </w:r>
+              <w:t>aspecto</w:t>
+            </w:r>
+            <w:proofErr w:type="spellEnd"/>
             <w:r>
               <w:rPr>
                 <w:rFonts w:ascii="Calibri" w:eastAsia="Calibri" w:hAnsi="Calibri" w:cs="Calibri"/>
                 <w:sz w:val="20"/>
                 <w:szCs w:val="20"/>
               </w:rPr>
-              <w:t>n</w:t>
-            </w:r>
+              <w:t xml:space="preserve"> </w:t>
+            </w:r>
+            <w:proofErr w:type="spellStart"/>
             <w:r>
               <w:rPr>
                 <w:rFonts w:ascii="Calibri" w:eastAsia="Calibri" w:hAnsi="Calibri" w:cs="Calibri"/>
                 <w:sz w:val="20"/>
                 <w:szCs w:val="20"/>
               </w:rPr>
-              <w:t>o emocional.</w:t>
+              <w:t>fís</w:t>
+            </w:r>
+            <w:r>
+              <w:rPr>
+                <w:rFonts w:ascii="Calibri" w:eastAsia="Calibri" w:hAnsi="Calibri" w:cs="Calibri"/>
+                <w:sz w:val="20"/>
+                <w:szCs w:val="20"/>
+              </w:rPr>
+              <w:t>i</w:t>
+            </w:r>
+            <w:r>
+              <w:rPr>
+                <w:rFonts w:ascii="Calibri" w:eastAsia="Calibri" w:hAnsi="Calibri" w:cs="Calibri"/>
+                <w:sz w:val="20"/>
+                <w:szCs w:val="20"/>
+              </w:rPr>
+              <w:t>co</w:t>
+            </w:r>
+            <w:proofErr w:type="spellEnd"/>
+            <w:r>
+              <w:rPr>
+                <w:rFonts w:ascii="Calibri" w:eastAsia="Calibri" w:hAnsi="Calibri" w:cs="Calibri"/>
+                <w:sz w:val="20"/>
+                <w:szCs w:val="20"/>
+              </w:rPr>
+              <w:t xml:space="preserve"> </w:t>
+            </w:r>
+            <w:proofErr w:type="spellStart"/>
+            <w:r>
+              <w:rPr>
+                <w:rFonts w:ascii="Calibri" w:eastAsia="Calibri" w:hAnsi="Calibri" w:cs="Calibri"/>
+                <w:sz w:val="20"/>
+                <w:szCs w:val="20"/>
+              </w:rPr>
+              <w:t>como</w:t>
+            </w:r>
+            <w:proofErr w:type="spellEnd"/>
+            <w:r>
+              <w:rPr>
+                <w:rFonts w:ascii="Calibri" w:eastAsia="Calibri" w:hAnsi="Calibri" w:cs="Calibri"/>
+                <w:sz w:val="20"/>
+                <w:szCs w:val="20"/>
+              </w:rPr>
+              <w:t xml:space="preserve"> </w:t>
+            </w:r>
+            <w:r>
+              <w:rPr>
+                <w:rFonts w:ascii="Calibri" w:eastAsia="Calibri" w:hAnsi="Calibri" w:cs="Calibri"/>
+                <w:sz w:val="20"/>
+                <w:szCs w:val="20"/>
+              </w:rPr>
+              <w:t>n</w:t>
+            </w:r>
+            <w:r>
+              <w:rPr>
+                <w:rFonts w:ascii="Calibri" w:eastAsia="Calibri" w:hAnsi="Calibri" w:cs="Calibri"/>
+                <w:sz w:val="20"/>
+                <w:szCs w:val="20"/>
+              </w:rPr>
+              <w:t xml:space="preserve">o </w:t>
+            </w:r>
+            <w:proofErr w:type="spellStart"/>
+            <w:r>
+              <w:rPr>
+                <w:rFonts w:ascii="Calibri" w:eastAsia="Calibri" w:hAnsi="Calibri" w:cs="Calibri"/>
+                <w:sz w:val="20"/>
+                <w:szCs w:val="20"/>
+              </w:rPr>
+              <w:t>emocional</w:t>
+            </w:r>
+            <w:proofErr w:type="spellEnd"/>
+            <w:r>
+              <w:rPr>
+                <w:rFonts w:ascii="Calibri" w:eastAsia="Calibri" w:hAnsi="Calibri" w:cs="Calibri"/>
+                <w:sz w:val="20"/>
+                <w:szCs w:val="20"/>
+              </w:rPr>
+              <w:t>.</w:t>
             </w:r>
           </w:p>
         </w:tc>
@@ -2603,6 +2999,7 @@
               </w:rPr>
               <w:t xml:space="preserve">{%tr for k, v in </w:t>
             </w:r>
+            <w:proofErr w:type="spellStart"/>
             <w:r>
               <w:rPr>
                 <w:rFonts w:ascii="Calibri" w:eastAsia="Calibri" w:hAnsi="Calibri" w:cs="Calibri"/>
@@ -2622,13 +3019,29 @@
                 <w:rFonts w:ascii="Calibri" w:eastAsia="Calibri" w:hAnsi="Calibri" w:cs="Calibri"/>
                 <w:lang w:val="en-US"/>
               </w:rPr>
-              <w:t>_patologies</w:t>
-            </w:r>
-            <w:r>
-              <w:rPr>
-                <w:rFonts w:ascii="Calibri" w:eastAsia="Calibri" w:hAnsi="Calibri" w:cs="Calibri"/>
-              </w:rPr>
-              <w:t>.items()%}</w:t>
+              <w:t>_</w:t>
+            </w:r>
+            <w:proofErr w:type="gramStart"/>
+            <w:r>
+              <w:rPr>
+                <w:rFonts w:ascii="Calibri" w:eastAsia="Calibri" w:hAnsi="Calibri" w:cs="Calibri"/>
+                <w:lang w:val="en-US"/>
+              </w:rPr>
+              <w:t>patologies</w:t>
+            </w:r>
+            <w:proofErr w:type="spellEnd"/>
+            <w:r>
+              <w:rPr>
+                <w:rFonts w:ascii="Calibri" w:eastAsia="Calibri" w:hAnsi="Calibri" w:cs="Calibri"/>
+              </w:rPr>
+              <w:t>.items()%</w:t>
+            </w:r>
+            <w:proofErr w:type="gramEnd"/>
+            <w:r>
+              <w:rPr>
+                <w:rFonts w:ascii="Calibri" w:eastAsia="Calibri" w:hAnsi="Calibri" w:cs="Calibri"/>
+              </w:rPr>
+              <w:t>}</w:t>
             </w:r>
           </w:p>
         </w:tc>
@@ -2712,7 +3125,21 @@
               <w:rPr>
                 <w:rFonts w:ascii="Calibri" w:eastAsia="Calibri" w:hAnsi="Calibri" w:cs="Calibri"/>
               </w:rPr>
-              <w:t>{%tr endfor %}</w:t>
+              <w:t xml:space="preserve">{%tr </w:t>
+            </w:r>
+            <w:proofErr w:type="spellStart"/>
+            <w:r>
+              <w:rPr>
+                <w:rFonts w:ascii="Calibri" w:eastAsia="Calibri" w:hAnsi="Calibri" w:cs="Calibri"/>
+              </w:rPr>
+              <w:t>endfor</w:t>
+            </w:r>
+            <w:proofErr w:type="spellEnd"/>
+            <w:r>
+              <w:rPr>
+                <w:rFonts w:ascii="Calibri" w:eastAsia="Calibri" w:hAnsi="Calibri" w:cs="Calibri"/>
+              </w:rPr>
+              <w:t xml:space="preserve"> %}</w:t>
             </w:r>
           </w:p>
         </w:tc>
@@ -2775,61 +3202,7 @@
                 <w:bCs/>
                 <w:lang w:val="pt-BR"/>
               </w:rPr>
-              <w:t>MICRORGANISMOS DETECTADOS NO OBERON/META HUNTER</w:t>
-            </w:r>
-            <w:r>
-              <w:rPr>
-                <w:rFonts w:ascii="Calibri" w:eastAsia="Calibri" w:hAnsi="Calibri" w:cs="Calibri"/>
-                <w:b/>
-                <w:bCs/>
-                <w:lang w:val="pt-BR"/>
-              </w:rPr>
-              <w:t xml:space="preserve"> </w:t>
-            </w:r>
-            <w:r>
-              <w:rPr>
-                <w:rFonts w:ascii="Calibri" w:eastAsia="Calibri" w:hAnsi="Calibri" w:cs="Calibri"/>
-                <w:b/>
-                <w:bCs/>
-                <w:lang w:val="pt-BR"/>
-              </w:rPr>
-              <w:t>–</w:t>
-            </w:r>
-            <w:r>
-              <w:rPr>
-                <w:rFonts w:ascii="Calibri" w:eastAsia="Calibri" w:hAnsi="Calibri" w:cs="Calibri"/>
-                <w:b/>
-                <w:bCs/>
-                <w:lang w:val="pt-BR"/>
-              </w:rPr>
-              <w:t xml:space="preserve"> TIPO</w:t>
-            </w:r>
-            <w:r>
-              <w:rPr>
-                <w:rFonts w:ascii="Calibri" w:eastAsia="Calibri" w:hAnsi="Calibri" w:cs="Calibri"/>
-                <w:b/>
-                <w:bCs/>
-                <w:lang w:val="pt-BR"/>
-              </w:rPr>
-              <w:t xml:space="preserve"> </w:t>
-            </w:r>
-            <w:r>
-              <w:rPr>
-                <w:rFonts w:ascii="Calibri" w:eastAsia="Calibri" w:hAnsi="Calibri" w:cs="Calibri"/>
-                <w:b/>
-                <w:bCs/>
-                <w:lang w:val="pt-BR"/>
-              </w:rPr>
-              <w:t>–</w:t>
-            </w:r>
-            <w:r>
-              <w:rPr>
-                <w:rFonts w:ascii="Calibri" w:eastAsia="Calibri" w:hAnsi="Calibri" w:cs="Calibri"/>
-                <w:b/>
-                <w:bCs/>
-                <w:lang w:val="pt-BR"/>
-              </w:rPr>
-              <w:t xml:space="preserve"> SINTOMAS FREQUENTES</w:t>
+              <w:t>MICRORGANISMOS PARTE 1 – TIPO – SINTOMAS FREQUENTES</w:t>
             </w:r>
           </w:p>
         </w:tc>
@@ -2880,7 +3253,21 @@
               <w:rPr>
                 <w:rFonts w:ascii="Calibri" w:eastAsia="Calibri" w:hAnsi="Calibri" w:cs="Calibri"/>
               </w:rPr>
-              <w:t>{%tr for item in table_microorganism%}</w:t>
+              <w:t xml:space="preserve">{%tr for item in </w:t>
+            </w:r>
+            <w:proofErr w:type="spellStart"/>
+            <w:r>
+              <w:rPr>
+                <w:rFonts w:ascii="Calibri" w:eastAsia="Calibri" w:hAnsi="Calibri" w:cs="Calibri"/>
+              </w:rPr>
+              <w:t>table_microorganism</w:t>
+            </w:r>
+            <w:proofErr w:type="spellEnd"/>
+            <w:r>
+              <w:rPr>
+                <w:rFonts w:ascii="Calibri" w:eastAsia="Calibri" w:hAnsi="Calibri" w:cs="Calibri"/>
+              </w:rPr>
+              <w:t>%}</w:t>
             </w:r>
           </w:p>
         </w:tc>
@@ -2906,7 +3293,27 @@
                 <w:b/>
                 <w:bCs/>
               </w:rPr>
-              <w:t>{{item.nome}}</w:t>
+              <w:t>{{</w:t>
+            </w:r>
+            <w:proofErr w:type="spellStart"/>
+            <w:proofErr w:type="gramStart"/>
+            <w:r>
+              <w:rPr>
+                <w:rFonts w:ascii="Calibri" w:eastAsia="Calibri" w:hAnsi="Calibri" w:cs="Calibri"/>
+                <w:b/>
+                <w:bCs/>
+              </w:rPr>
+              <w:t>item.nome</w:t>
+            </w:r>
+            <w:proofErr w:type="spellEnd"/>
+            <w:proofErr w:type="gramEnd"/>
+            <w:r>
+              <w:rPr>
+                <w:rFonts w:ascii="Calibri" w:eastAsia="Calibri" w:hAnsi="Calibri" w:cs="Calibri"/>
+                <w:b/>
+                <w:bCs/>
+              </w:rPr>
+              <w:t>}}</w:t>
             </w:r>
             <w:r>
               <w:rPr>
@@ -2918,7 +3325,23 @@
               <w:rPr>
                 <w:rFonts w:ascii="Calibri" w:eastAsia="Calibri" w:hAnsi="Calibri" w:cs="Calibri"/>
               </w:rPr>
-              <w:t>{{item.tipo}}</w:t>
+              <w:t>{{</w:t>
+            </w:r>
+            <w:proofErr w:type="spellStart"/>
+            <w:proofErr w:type="gramStart"/>
+            <w:r>
+              <w:rPr>
+                <w:rFonts w:ascii="Calibri" w:eastAsia="Calibri" w:hAnsi="Calibri" w:cs="Calibri"/>
+              </w:rPr>
+              <w:t>item.tipo</w:t>
+            </w:r>
+            <w:proofErr w:type="spellEnd"/>
+            <w:proofErr w:type="gramEnd"/>
+            <w:r>
+              <w:rPr>
+                <w:rFonts w:ascii="Calibri" w:eastAsia="Calibri" w:hAnsi="Calibri" w:cs="Calibri"/>
+              </w:rPr>
+              <w:t>}}</w:t>
             </w:r>
             <w:r>
               <w:rPr>
@@ -2942,7 +3365,23 @@
               <w:rPr>
                 <w:rFonts w:ascii="Calibri" w:eastAsia="Calibri" w:hAnsi="Calibri" w:cs="Calibri"/>
               </w:rPr>
-              <w:t>{{item.sintomas}}</w:t>
+              <w:t>{{</w:t>
+            </w:r>
+            <w:proofErr w:type="spellStart"/>
+            <w:proofErr w:type="gramStart"/>
+            <w:r>
+              <w:rPr>
+                <w:rFonts w:ascii="Calibri" w:eastAsia="Calibri" w:hAnsi="Calibri" w:cs="Calibri"/>
+              </w:rPr>
+              <w:t>item.sintomas</w:t>
+            </w:r>
+            <w:proofErr w:type="spellEnd"/>
+            <w:proofErr w:type="gramEnd"/>
+            <w:r>
+              <w:rPr>
+                <w:rFonts w:ascii="Calibri" w:eastAsia="Calibri" w:hAnsi="Calibri" w:cs="Calibri"/>
+              </w:rPr>
+              <w:t>}}</w:t>
             </w:r>
           </w:p>
         </w:tc>
@@ -2962,7 +3401,23 @@
               <w:rPr>
                 <w:rFonts w:ascii="Calibri" w:eastAsia="Calibri" w:hAnsi="Calibri" w:cs="Calibri"/>
               </w:rPr>
-              <w:t>{{item.D}}</w:t>
+              <w:t>{{</w:t>
+            </w:r>
+            <w:proofErr w:type="spellStart"/>
+            <w:proofErr w:type="gramStart"/>
+            <w:r>
+              <w:rPr>
+                <w:rFonts w:ascii="Calibri" w:eastAsia="Calibri" w:hAnsi="Calibri" w:cs="Calibri"/>
+              </w:rPr>
+              <w:t>item.D</w:t>
+            </w:r>
+            <w:proofErr w:type="spellEnd"/>
+            <w:proofErr w:type="gramEnd"/>
+            <w:r>
+              <w:rPr>
+                <w:rFonts w:ascii="Calibri" w:eastAsia="Calibri" w:hAnsi="Calibri" w:cs="Calibri"/>
+              </w:rPr>
+              <w:t>}}</w:t>
             </w:r>
           </w:p>
         </w:tc>
@@ -2988,7 +3443,21 @@
               <w:rPr>
                 <w:rFonts w:ascii="Calibri" w:eastAsia="Calibri" w:hAnsi="Calibri" w:cs="Calibri"/>
               </w:rPr>
-              <w:t>{%tr endfor %}</w:t>
+              <w:t xml:space="preserve">{%tr </w:t>
+            </w:r>
+            <w:proofErr w:type="spellStart"/>
+            <w:r>
+              <w:rPr>
+                <w:rFonts w:ascii="Calibri" w:eastAsia="Calibri" w:hAnsi="Calibri" w:cs="Calibri"/>
+              </w:rPr>
+              <w:t>endfor</w:t>
+            </w:r>
+            <w:proofErr w:type="spellEnd"/>
+            <w:r>
+              <w:rPr>
+                <w:rFonts w:ascii="Calibri" w:eastAsia="Calibri" w:hAnsi="Calibri" w:cs="Calibri"/>
+              </w:rPr>
+              <w:t xml:space="preserve"> %}</w:t>
             </w:r>
           </w:p>
         </w:tc>
@@ -3174,7 +3643,14 @@
               <w:rPr>
                 <w:rFonts w:ascii="Calibri" w:eastAsia="Calibri" w:hAnsi="Calibri" w:cs="Calibri"/>
               </w:rPr>
-              <w:t>{%tr for item in tab</w:t>
+              <w:t xml:space="preserve">{%tr for item in </w:t>
+            </w:r>
+            <w:proofErr w:type="spellStart"/>
+            <w:r>
+              <w:rPr>
+                <w:rFonts w:ascii="Calibri" w:eastAsia="Calibri" w:hAnsi="Calibri" w:cs="Calibri"/>
+              </w:rPr>
+              <w:t>tab</w:t>
             </w:r>
             <w:r>
               <w:rPr>
@@ -3182,6 +3658,7 @@
               </w:rPr>
               <w:t>le_prosync</w:t>
             </w:r>
+            <w:proofErr w:type="spellEnd"/>
             <w:r>
               <w:rPr>
                 <w:rFonts w:ascii="Calibri" w:eastAsia="Calibri" w:hAnsi="Calibri" w:cs="Calibri"/>
@@ -3212,13 +3689,49 @@
                 <w:b/>
                 <w:bCs/>
               </w:rPr>
-              <w:t>{{item.nome}}</w:t>
-            </w:r>
-            <w:r>
-              <w:rPr>
-                <w:rFonts w:ascii="Calibri" w:eastAsia="Calibri" w:hAnsi="Calibri" w:cs="Calibri"/>
-              </w:rPr>
-              <w:t xml:space="preserve"> – {{item.tipo}} </w:t>
+              <w:t>{{</w:t>
+            </w:r>
+            <w:proofErr w:type="spellStart"/>
+            <w:proofErr w:type="gramStart"/>
+            <w:r>
+              <w:rPr>
+                <w:rFonts w:ascii="Calibri" w:eastAsia="Calibri" w:hAnsi="Calibri" w:cs="Calibri"/>
+                <w:b/>
+                <w:bCs/>
+              </w:rPr>
+              <w:t>item.nome</w:t>
+            </w:r>
+            <w:proofErr w:type="spellEnd"/>
+            <w:proofErr w:type="gramEnd"/>
+            <w:r>
+              <w:rPr>
+                <w:rFonts w:ascii="Calibri" w:eastAsia="Calibri" w:hAnsi="Calibri" w:cs="Calibri"/>
+                <w:b/>
+                <w:bCs/>
+              </w:rPr>
+              <w:t>}}</w:t>
+            </w:r>
+            <w:r>
+              <w:rPr>
+                <w:rFonts w:ascii="Calibri" w:eastAsia="Calibri" w:hAnsi="Calibri" w:cs="Calibri"/>
+              </w:rPr>
+              <w:t xml:space="preserve"> – {{</w:t>
+            </w:r>
+            <w:proofErr w:type="spellStart"/>
+            <w:proofErr w:type="gramStart"/>
+            <w:r>
+              <w:rPr>
+                <w:rFonts w:ascii="Calibri" w:eastAsia="Calibri" w:hAnsi="Calibri" w:cs="Calibri"/>
+              </w:rPr>
+              <w:t>item.tipo</w:t>
+            </w:r>
+            <w:proofErr w:type="spellEnd"/>
+            <w:proofErr w:type="gramEnd"/>
+            <w:r>
+              <w:rPr>
+                <w:rFonts w:ascii="Calibri" w:eastAsia="Calibri" w:hAnsi="Calibri" w:cs="Calibri"/>
+              </w:rPr>
+              <w:t xml:space="preserve">}} </w:t>
             </w:r>
             <w:r>
               <w:rPr>
@@ -3230,7 +3743,23 @@
               <w:rPr>
                 <w:rFonts w:ascii="Calibri" w:eastAsia="Calibri" w:hAnsi="Calibri" w:cs="Calibri"/>
               </w:rPr>
-              <w:t xml:space="preserve"> {{item.sintomas}}</w:t>
+              <w:t xml:space="preserve"> {{</w:t>
+            </w:r>
+            <w:proofErr w:type="spellStart"/>
+            <w:proofErr w:type="gramStart"/>
+            <w:r>
+              <w:rPr>
+                <w:rFonts w:ascii="Calibri" w:eastAsia="Calibri" w:hAnsi="Calibri" w:cs="Calibri"/>
+              </w:rPr>
+              <w:t>item.sintomas</w:t>
+            </w:r>
+            <w:proofErr w:type="spellEnd"/>
+            <w:proofErr w:type="gramEnd"/>
+            <w:r>
+              <w:rPr>
+                <w:rFonts w:ascii="Calibri" w:eastAsia="Calibri" w:hAnsi="Calibri" w:cs="Calibri"/>
+              </w:rPr>
+              <w:t>}}</w:t>
             </w:r>
           </w:p>
         </w:tc>
@@ -3250,7 +3779,23 @@
               <w:rPr>
                 <w:rFonts w:ascii="Calibri" w:eastAsia="Calibri" w:hAnsi="Calibri" w:cs="Calibri"/>
               </w:rPr>
-              <w:t>{{item.D}}</w:t>
+              <w:t>{{</w:t>
+            </w:r>
+            <w:proofErr w:type="spellStart"/>
+            <w:proofErr w:type="gramStart"/>
+            <w:r>
+              <w:rPr>
+                <w:rFonts w:ascii="Calibri" w:eastAsia="Calibri" w:hAnsi="Calibri" w:cs="Calibri"/>
+              </w:rPr>
+              <w:t>item.D</w:t>
+            </w:r>
+            <w:proofErr w:type="spellEnd"/>
+            <w:proofErr w:type="gramEnd"/>
+            <w:r>
+              <w:rPr>
+                <w:rFonts w:ascii="Calibri" w:eastAsia="Calibri" w:hAnsi="Calibri" w:cs="Calibri"/>
+              </w:rPr>
+              <w:t>}}</w:t>
             </w:r>
           </w:p>
         </w:tc>
@@ -3276,7 +3821,21 @@
               <w:rPr>
                 <w:rFonts w:ascii="Calibri" w:eastAsia="Calibri" w:hAnsi="Calibri" w:cs="Calibri"/>
               </w:rPr>
-              <w:t>{%tr endfor %}</w:t>
+              <w:t xml:space="preserve">{%tr </w:t>
+            </w:r>
+            <w:proofErr w:type="spellStart"/>
+            <w:r>
+              <w:rPr>
+                <w:rFonts w:ascii="Calibri" w:eastAsia="Calibri" w:hAnsi="Calibri" w:cs="Calibri"/>
+              </w:rPr>
+              <w:t>endfor</w:t>
+            </w:r>
+            <w:proofErr w:type="spellEnd"/>
+            <w:r>
+              <w:rPr>
+                <w:rFonts w:ascii="Calibri" w:eastAsia="Calibri" w:hAnsi="Calibri" w:cs="Calibri"/>
+              </w:rPr>
+              <w:t xml:space="preserve"> %}</w:t>
             </w:r>
           </w:p>
         </w:tc>
@@ -3421,7 +3980,21 @@
               <w:rPr>
                 <w:rFonts w:ascii="Calibri" w:eastAsia="Calibri" w:hAnsi="Calibri" w:cs="Calibri"/>
               </w:rPr>
-              <w:t>{%tr for item in table_toxins%}</w:t>
+              <w:t xml:space="preserve">{%tr for item in </w:t>
+            </w:r>
+            <w:proofErr w:type="spellStart"/>
+            <w:r>
+              <w:rPr>
+                <w:rFonts w:ascii="Calibri" w:eastAsia="Calibri" w:hAnsi="Calibri" w:cs="Calibri"/>
+              </w:rPr>
+              <w:t>table_toxins</w:t>
+            </w:r>
+            <w:proofErr w:type="spellEnd"/>
+            <w:r>
+              <w:rPr>
+                <w:rFonts w:ascii="Calibri" w:eastAsia="Calibri" w:hAnsi="Calibri" w:cs="Calibri"/>
+              </w:rPr>
+              <w:t>%}</w:t>
             </w:r>
           </w:p>
         </w:tc>
@@ -3446,14 +4019,34 @@
                 <w:b/>
                 <w:bCs/>
               </w:rPr>
-              <w:t>{{item.nome}}</w:t>
-            </w:r>
+              <w:t>{{</w:t>
+            </w:r>
+            <w:proofErr w:type="spellStart"/>
+            <w:proofErr w:type="gramStart"/>
             <w:r>
               <w:rPr>
                 <w:rFonts w:ascii="Calibri" w:eastAsia="Calibri" w:hAnsi="Calibri" w:cs="Calibri"/>
                 <w:b/>
                 <w:bCs/>
               </w:rPr>
+              <w:t>item.nome</w:t>
+            </w:r>
+            <w:proofErr w:type="spellEnd"/>
+            <w:proofErr w:type="gramEnd"/>
+            <w:r>
+              <w:rPr>
+                <w:rFonts w:ascii="Calibri" w:eastAsia="Calibri" w:hAnsi="Calibri" w:cs="Calibri"/>
+                <w:b/>
+                <w:bCs/>
+              </w:rPr>
+              <w:t>}}</w:t>
+            </w:r>
+            <w:r>
+              <w:rPr>
+                <w:rFonts w:ascii="Calibri" w:eastAsia="Calibri" w:hAnsi="Calibri" w:cs="Calibri"/>
+                <w:b/>
+                <w:bCs/>
+              </w:rPr>
               <w:t xml:space="preserve"> </w:t>
             </w:r>
             <w:r>
@@ -3474,7 +4067,23 @@
               <w:rPr>
                 <w:rFonts w:ascii="Calibri" w:eastAsia="Calibri" w:hAnsi="Calibri" w:cs="Calibri"/>
               </w:rPr>
-              <w:t>{{item.efeitos}}</w:t>
+              <w:t>{{</w:t>
+            </w:r>
+            <w:proofErr w:type="spellStart"/>
+            <w:proofErr w:type="gramStart"/>
+            <w:r>
+              <w:rPr>
+                <w:rFonts w:ascii="Calibri" w:eastAsia="Calibri" w:hAnsi="Calibri" w:cs="Calibri"/>
+              </w:rPr>
+              <w:t>item.efeitos</w:t>
+            </w:r>
+            <w:proofErr w:type="spellEnd"/>
+            <w:proofErr w:type="gramEnd"/>
+            <w:r>
+              <w:rPr>
+                <w:rFonts w:ascii="Calibri" w:eastAsia="Calibri" w:hAnsi="Calibri" w:cs="Calibri"/>
+              </w:rPr>
+              <w:t>}}</w:t>
             </w:r>
           </w:p>
         </w:tc>
@@ -3494,7 +4103,23 @@
               <w:rPr>
                 <w:rFonts w:ascii="Calibri" w:eastAsia="Calibri" w:hAnsi="Calibri" w:cs="Calibri"/>
               </w:rPr>
-              <w:t>{{item.D}}</w:t>
+              <w:t>{{</w:t>
+            </w:r>
+            <w:proofErr w:type="spellStart"/>
+            <w:proofErr w:type="gramStart"/>
+            <w:r>
+              <w:rPr>
+                <w:rFonts w:ascii="Calibri" w:eastAsia="Calibri" w:hAnsi="Calibri" w:cs="Calibri"/>
+              </w:rPr>
+              <w:t>item.D</w:t>
+            </w:r>
+            <w:proofErr w:type="spellEnd"/>
+            <w:proofErr w:type="gramEnd"/>
+            <w:r>
+              <w:rPr>
+                <w:rFonts w:ascii="Calibri" w:eastAsia="Calibri" w:hAnsi="Calibri" w:cs="Calibri"/>
+              </w:rPr>
+              <w:t>}}</w:t>
             </w:r>
           </w:p>
         </w:tc>
@@ -3517,7 +4142,21 @@
                 <w:rFonts w:ascii="Calibri" w:eastAsia="Calibri" w:hAnsi="Calibri" w:cs="Calibri"/>
               </w:rPr>
               <w:lastRenderedPageBreak/>
-              <w:t>{%tr endfor %}</w:t>
+              <w:t xml:space="preserve">{%tr </w:t>
+            </w:r>
+            <w:proofErr w:type="spellStart"/>
+            <w:r>
+              <w:rPr>
+                <w:rFonts w:ascii="Calibri" w:eastAsia="Calibri" w:hAnsi="Calibri" w:cs="Calibri"/>
+              </w:rPr>
+              <w:t>endfor</w:t>
+            </w:r>
+            <w:proofErr w:type="spellEnd"/>
+            <w:r>
+              <w:rPr>
+                <w:rFonts w:ascii="Calibri" w:eastAsia="Calibri" w:hAnsi="Calibri" w:cs="Calibri"/>
+              </w:rPr>
+              <w:t xml:space="preserve"> %}</w:t>
             </w:r>
           </w:p>
         </w:tc>
@@ -3755,13 +4394,23 @@
                 <w:bCs/>
               </w:rPr>
             </w:pPr>
+            <w:proofErr w:type="gramStart"/>
             <w:r>
               <w:rPr>
                 <w:rFonts w:ascii="Calibri" w:eastAsia="Calibri" w:hAnsi="Calibri" w:cs="Calibri"/>
                 <w:b/>
                 <w:bCs/>
               </w:rPr>
-              <w:t>A EVITAR</w:t>
+              <w:t>A</w:t>
+            </w:r>
+            <w:proofErr w:type="gramEnd"/>
+            <w:r>
+              <w:rPr>
+                <w:rFonts w:ascii="Calibri" w:eastAsia="Calibri" w:hAnsi="Calibri" w:cs="Calibri"/>
+                <w:b/>
+                <w:bCs/>
+              </w:rPr>
+              <w:t xml:space="preserve"> EVITAR</w:t>
             </w:r>
           </w:p>
         </w:tc>
@@ -3841,7 +4490,14 @@
               <w:rPr>
                 <w:rFonts w:ascii="Calibri" w:eastAsia="Calibri" w:hAnsi="Calibri" w:cs="Calibri"/>
               </w:rPr>
-              <w:t>in table_</w:t>
+              <w:t xml:space="preserve">in </w:t>
+            </w:r>
+            <w:proofErr w:type="spellStart"/>
+            <w:r>
+              <w:rPr>
+                <w:rFonts w:ascii="Calibri" w:eastAsia="Calibri" w:hAnsi="Calibri" w:cs="Calibri"/>
+              </w:rPr>
+              <w:t>table_</w:t>
             </w:r>
             <w:r>
               <w:rPr>
@@ -3849,6 +4505,7 @@
               </w:rPr>
               <w:t>food</w:t>
             </w:r>
+            <w:proofErr w:type="spellEnd"/>
             <w:r>
               <w:rPr>
                 <w:rFonts w:ascii="Calibri" w:eastAsia="Calibri" w:hAnsi="Calibri" w:cs="Calibri"/>
@@ -3883,6 +4540,7 @@
               </w:rPr>
               <w:t>{{</w:t>
             </w:r>
+            <w:proofErr w:type="gramStart"/>
             <w:r>
               <w:rPr>
                 <w:rFonts w:ascii="Calibri" w:eastAsia="Calibri" w:hAnsi="Calibri" w:cs="Calibri"/>
@@ -3893,7 +4551,14 @@
               <w:rPr>
                 <w:rFonts w:ascii="Calibri" w:eastAsia="Calibri" w:hAnsi="Calibri" w:cs="Calibri"/>
               </w:rPr>
-              <w:t>[0]</w:t>
+              <w:t>[</w:t>
+            </w:r>
+            <w:proofErr w:type="gramEnd"/>
+            <w:r>
+              <w:rPr>
+                <w:rFonts w:ascii="Calibri" w:eastAsia="Calibri" w:hAnsi="Calibri" w:cs="Calibri"/>
+              </w:rPr>
+              <w:t>0]</w:t>
             </w:r>
             <w:r>
               <w:rPr>
@@ -3921,6 +4586,7 @@
                 <w:rFonts w:ascii="Calibri" w:eastAsia="Calibri" w:hAnsi="Calibri" w:cs="Calibri"/>
               </w:rPr>
             </w:pPr>
+            <w:proofErr w:type="gramStart"/>
             <w:r>
               <w:rPr>
                 <w:rFonts w:ascii="Calibri" w:eastAsia="Calibri" w:hAnsi="Calibri" w:cs="Calibri"/>
@@ -3931,7 +4597,14 @@
               <w:rPr>
                 <w:rFonts w:ascii="Calibri" w:eastAsia="Calibri" w:hAnsi="Calibri" w:cs="Calibri"/>
               </w:rPr>
-              <w:t xml:space="preserve"> row[1]</w:t>
+              <w:t xml:space="preserve"> row</w:t>
+            </w:r>
+            <w:proofErr w:type="gramEnd"/>
+            <w:r>
+              <w:rPr>
+                <w:rFonts w:ascii="Calibri" w:eastAsia="Calibri" w:hAnsi="Calibri" w:cs="Calibri"/>
+              </w:rPr>
+              <w:t>[1]</w:t>
             </w:r>
             <w:r>
               <w:rPr>
@@ -3965,11 +4638,19 @@
               </w:rPr>
               <w:t>{{</w:t>
             </w:r>
-            <w:r>
-              <w:rPr>
-                <w:rFonts w:ascii="Calibri" w:eastAsia="Calibri" w:hAnsi="Calibri" w:cs="Calibri"/>
-              </w:rPr>
-              <w:t>row[2]</w:t>
+            <w:proofErr w:type="gramStart"/>
+            <w:r>
+              <w:rPr>
+                <w:rFonts w:ascii="Calibri" w:eastAsia="Calibri" w:hAnsi="Calibri" w:cs="Calibri"/>
+              </w:rPr>
+              <w:t>row[</w:t>
+            </w:r>
+            <w:proofErr w:type="gramEnd"/>
+            <w:r>
+              <w:rPr>
+                <w:rFonts w:ascii="Calibri" w:eastAsia="Calibri" w:hAnsi="Calibri" w:cs="Calibri"/>
+              </w:rPr>
+              <w:t>2]</w:t>
             </w:r>
             <w:r>
               <w:rPr>
@@ -3997,6 +4678,7 @@
                 <w:rFonts w:ascii="Calibri" w:eastAsia="Calibri" w:hAnsi="Calibri" w:cs="Calibri"/>
               </w:rPr>
             </w:pPr>
+            <w:proofErr w:type="gramStart"/>
             <w:r>
               <w:rPr>
                 <w:rFonts w:ascii="Calibri" w:eastAsia="Calibri" w:hAnsi="Calibri" w:cs="Calibri"/>
@@ -4007,7 +4689,14 @@
               <w:rPr>
                 <w:rFonts w:ascii="Calibri" w:eastAsia="Calibri" w:hAnsi="Calibri" w:cs="Calibri"/>
               </w:rPr>
-              <w:t xml:space="preserve"> row[3]</w:t>
+              <w:t xml:space="preserve"> row</w:t>
+            </w:r>
+            <w:proofErr w:type="gramEnd"/>
+            <w:r>
+              <w:rPr>
+                <w:rFonts w:ascii="Calibri" w:eastAsia="Calibri" w:hAnsi="Calibri" w:cs="Calibri"/>
+              </w:rPr>
+              <w:t>[3]</w:t>
             </w:r>
             <w:r>
               <w:rPr>
@@ -4035,6 +4724,7 @@
                 <w:rFonts w:ascii="Calibri" w:eastAsia="Calibri" w:hAnsi="Calibri" w:cs="Calibri"/>
               </w:rPr>
             </w:pPr>
+            <w:proofErr w:type="gramStart"/>
             <w:r>
               <w:rPr>
                 <w:rFonts w:ascii="Calibri" w:eastAsia="Calibri" w:hAnsi="Calibri" w:cs="Calibri"/>
@@ -4045,7 +4735,14 @@
               <w:rPr>
                 <w:rFonts w:ascii="Calibri" w:eastAsia="Calibri" w:hAnsi="Calibri" w:cs="Calibri"/>
               </w:rPr>
-              <w:t xml:space="preserve"> row[4]</w:t>
+              <w:t xml:space="preserve"> row</w:t>
+            </w:r>
+            <w:proofErr w:type="gramEnd"/>
+            <w:r>
+              <w:rPr>
+                <w:rFonts w:ascii="Calibri" w:eastAsia="Calibri" w:hAnsi="Calibri" w:cs="Calibri"/>
+              </w:rPr>
+              <w:t>[4]</w:t>
             </w:r>
             <w:r>
               <w:rPr>
@@ -4073,6 +4770,7 @@
                 <w:rFonts w:ascii="Calibri" w:eastAsia="Calibri" w:hAnsi="Calibri" w:cs="Calibri"/>
               </w:rPr>
             </w:pPr>
+            <w:proofErr w:type="gramStart"/>
             <w:r>
               <w:rPr>
                 <w:rFonts w:ascii="Calibri" w:eastAsia="Calibri" w:hAnsi="Calibri" w:cs="Calibri"/>
@@ -4083,7 +4781,14 @@
               <w:rPr>
                 <w:rFonts w:ascii="Calibri" w:eastAsia="Calibri" w:hAnsi="Calibri" w:cs="Calibri"/>
               </w:rPr>
-              <w:t xml:space="preserve"> row[5]</w:t>
+              <w:t xml:space="preserve"> row</w:t>
+            </w:r>
+            <w:proofErr w:type="gramEnd"/>
+            <w:r>
+              <w:rPr>
+                <w:rFonts w:ascii="Calibri" w:eastAsia="Calibri" w:hAnsi="Calibri" w:cs="Calibri"/>
+              </w:rPr>
+              <w:t>[5]</w:t>
             </w:r>
             <w:r>
               <w:rPr>
@@ -4120,7 +4825,21 @@
               <w:rPr>
                 <w:rFonts w:ascii="Calibri" w:eastAsia="Calibri" w:hAnsi="Calibri" w:cs="Calibri"/>
               </w:rPr>
-              <w:t>{%tr endfor %}</w:t>
+              <w:t xml:space="preserve">{%tr </w:t>
+            </w:r>
+            <w:proofErr w:type="spellStart"/>
+            <w:r>
+              <w:rPr>
+                <w:rFonts w:ascii="Calibri" w:eastAsia="Calibri" w:hAnsi="Calibri" w:cs="Calibri"/>
+              </w:rPr>
+              <w:t>endfor</w:t>
+            </w:r>
+            <w:proofErr w:type="spellEnd"/>
+            <w:r>
+              <w:rPr>
+                <w:rFonts w:ascii="Calibri" w:eastAsia="Calibri" w:hAnsi="Calibri" w:cs="Calibri"/>
+              </w:rPr>
+              <w:t xml:space="preserve"> %}</w:t>
             </w:r>
           </w:p>
         </w:tc>
@@ -4361,7 +5080,35 @@
               <w:rPr>
                 <w:rFonts w:ascii="Calibri" w:eastAsia="Calibri" w:hAnsi="Calibri" w:cs="Calibri"/>
               </w:rPr>
-              <w:t>{%tr for k, v in table_emotions.items()%}</w:t>
+              <w:t xml:space="preserve">{%tr for k, v in </w:t>
+            </w:r>
+            <w:proofErr w:type="spellStart"/>
+            <w:r>
+              <w:rPr>
+                <w:rFonts w:ascii="Calibri" w:eastAsia="Calibri" w:hAnsi="Calibri" w:cs="Calibri"/>
+              </w:rPr>
+              <w:t>table_</w:t>
+            </w:r>
+            <w:proofErr w:type="gramStart"/>
+            <w:r>
+              <w:rPr>
+                <w:rFonts w:ascii="Calibri" w:eastAsia="Calibri" w:hAnsi="Calibri" w:cs="Calibri"/>
+              </w:rPr>
+              <w:t>emotions.items</w:t>
+            </w:r>
+            <w:proofErr w:type="spellEnd"/>
+            <w:r>
+              <w:rPr>
+                <w:rFonts w:ascii="Calibri" w:eastAsia="Calibri" w:hAnsi="Calibri" w:cs="Calibri"/>
+              </w:rPr>
+              <w:t>()%</w:t>
+            </w:r>
+            <w:proofErr w:type="gramEnd"/>
+            <w:r>
+              <w:rPr>
+                <w:rFonts w:ascii="Calibri" w:eastAsia="Calibri" w:hAnsi="Calibri" w:cs="Calibri"/>
+              </w:rPr>
+              <w:t>}</w:t>
             </w:r>
           </w:p>
         </w:tc>
@@ -4445,7 +5192,21 @@
               <w:rPr>
                 <w:rFonts w:ascii="Calibri" w:eastAsia="Calibri" w:hAnsi="Calibri" w:cs="Calibri"/>
               </w:rPr>
-              <w:t>{%tr endfor %}</w:t>
+              <w:t xml:space="preserve">{%tr </w:t>
+            </w:r>
+            <w:proofErr w:type="spellStart"/>
+            <w:r>
+              <w:rPr>
+                <w:rFonts w:ascii="Calibri" w:eastAsia="Calibri" w:hAnsi="Calibri" w:cs="Calibri"/>
+              </w:rPr>
+              <w:t>endfor</w:t>
+            </w:r>
+            <w:proofErr w:type="spellEnd"/>
+            <w:r>
+              <w:rPr>
+                <w:rFonts w:ascii="Calibri" w:eastAsia="Calibri" w:hAnsi="Calibri" w:cs="Calibri"/>
+              </w:rPr>
+              <w:t xml:space="preserve"> %}</w:t>
             </w:r>
           </w:p>
         </w:tc>
@@ -4675,7 +5436,21 @@
               <w:rPr>
                 <w:rFonts w:ascii="Calibri" w:eastAsia="Calibri" w:hAnsi="Calibri" w:cs="Calibri"/>
               </w:rPr>
-              <w:t>{%tr for item in table_crystals%}</w:t>
+              <w:t xml:space="preserve">{%tr for item in </w:t>
+            </w:r>
+            <w:proofErr w:type="spellStart"/>
+            <w:r>
+              <w:rPr>
+                <w:rFonts w:ascii="Calibri" w:eastAsia="Calibri" w:hAnsi="Calibri" w:cs="Calibri"/>
+              </w:rPr>
+              <w:t>table_crystals</w:t>
+            </w:r>
+            <w:proofErr w:type="spellEnd"/>
+            <w:r>
+              <w:rPr>
+                <w:rFonts w:ascii="Calibri" w:eastAsia="Calibri" w:hAnsi="Calibri" w:cs="Calibri"/>
+              </w:rPr>
+              <w:t>%}</w:t>
             </w:r>
           </w:p>
         </w:tc>
@@ -4701,7 +5476,23 @@
               <w:rPr>
                 <w:rFonts w:ascii="Calibri" w:eastAsia="Calibri" w:hAnsi="Calibri" w:cs="Calibri"/>
               </w:rPr>
-              <w:t>{{item.cristal}}</w:t>
+              <w:t>{{</w:t>
+            </w:r>
+            <w:proofErr w:type="spellStart"/>
+            <w:proofErr w:type="gramStart"/>
+            <w:r>
+              <w:rPr>
+                <w:rFonts w:ascii="Calibri" w:eastAsia="Calibri" w:hAnsi="Calibri" w:cs="Calibri"/>
+              </w:rPr>
+              <w:t>item.cristal</w:t>
+            </w:r>
+            <w:proofErr w:type="spellEnd"/>
+            <w:proofErr w:type="gramEnd"/>
+            <w:r>
+              <w:rPr>
+                <w:rFonts w:ascii="Calibri" w:eastAsia="Calibri" w:hAnsi="Calibri" w:cs="Calibri"/>
+              </w:rPr>
+              <w:t>}}</w:t>
             </w:r>
           </w:p>
         </w:tc>
@@ -4727,7 +5518,32 @@
                 <w:rFonts w:ascii="Calibri" w:eastAsia="Calibri" w:hAnsi="Calibri" w:cs="Calibri"/>
                 <w:lang w:val="pt-BR"/>
               </w:rPr>
-              <w:t>{{item.beneficios_fisicos}}</w:t>
+              <w:t>{{</w:t>
+            </w:r>
+            <w:proofErr w:type="spellStart"/>
+            <w:proofErr w:type="gramStart"/>
+            <w:r>
+              <w:rPr>
+                <w:rFonts w:ascii="Calibri" w:eastAsia="Calibri" w:hAnsi="Calibri" w:cs="Calibri"/>
+                <w:lang w:val="pt-BR"/>
+              </w:rPr>
+              <w:t>item.beneficios</w:t>
+            </w:r>
+            <w:proofErr w:type="gramEnd"/>
+            <w:r>
+              <w:rPr>
+                <w:rFonts w:ascii="Calibri" w:eastAsia="Calibri" w:hAnsi="Calibri" w:cs="Calibri"/>
+                <w:lang w:val="pt-BR"/>
+              </w:rPr>
+              <w:t>_fisicos</w:t>
+            </w:r>
+            <w:proofErr w:type="spellEnd"/>
+            <w:r>
+              <w:rPr>
+                <w:rFonts w:ascii="Calibri" w:eastAsia="Calibri" w:hAnsi="Calibri" w:cs="Calibri"/>
+                <w:lang w:val="pt-BR"/>
+              </w:rPr>
+              <w:t>}}</w:t>
             </w:r>
           </w:p>
         </w:tc>
@@ -4753,7 +5569,32 @@
                 <w:rFonts w:ascii="Calibri" w:eastAsia="Calibri" w:hAnsi="Calibri" w:cs="Calibri"/>
                 <w:lang w:val="pt-BR"/>
               </w:rPr>
-              <w:t>{{item.beneficios_emocionais}}</w:t>
+              <w:t>{{</w:t>
+            </w:r>
+            <w:proofErr w:type="spellStart"/>
+            <w:proofErr w:type="gramStart"/>
+            <w:r>
+              <w:rPr>
+                <w:rFonts w:ascii="Calibri" w:eastAsia="Calibri" w:hAnsi="Calibri" w:cs="Calibri"/>
+                <w:lang w:val="pt-BR"/>
+              </w:rPr>
+              <w:t>item.beneficios</w:t>
+            </w:r>
+            <w:proofErr w:type="gramEnd"/>
+            <w:r>
+              <w:rPr>
+                <w:rFonts w:ascii="Calibri" w:eastAsia="Calibri" w:hAnsi="Calibri" w:cs="Calibri"/>
+                <w:lang w:val="pt-BR"/>
+              </w:rPr>
+              <w:t>_emocionais</w:t>
+            </w:r>
+            <w:proofErr w:type="spellEnd"/>
+            <w:r>
+              <w:rPr>
+                <w:rFonts w:ascii="Calibri" w:eastAsia="Calibri" w:hAnsi="Calibri" w:cs="Calibri"/>
+                <w:lang w:val="pt-BR"/>
+              </w:rPr>
+              <w:t>}}</w:t>
             </w:r>
           </w:p>
         </w:tc>
@@ -4778,7 +5619,23 @@
               <w:rPr>
                 <w:rFonts w:ascii="Calibri" w:eastAsia="Calibri" w:hAnsi="Calibri" w:cs="Calibri"/>
               </w:rPr>
-              <w:t>{{item.D}}</w:t>
+              <w:t>{{</w:t>
+            </w:r>
+            <w:proofErr w:type="spellStart"/>
+            <w:proofErr w:type="gramStart"/>
+            <w:r>
+              <w:rPr>
+                <w:rFonts w:ascii="Calibri" w:eastAsia="Calibri" w:hAnsi="Calibri" w:cs="Calibri"/>
+              </w:rPr>
+              <w:t>item.D</w:t>
+            </w:r>
+            <w:proofErr w:type="spellEnd"/>
+            <w:proofErr w:type="gramEnd"/>
+            <w:r>
+              <w:rPr>
+                <w:rFonts w:ascii="Calibri" w:eastAsia="Calibri" w:hAnsi="Calibri" w:cs="Calibri"/>
+              </w:rPr>
+              <w:t>}}</w:t>
             </w:r>
           </w:p>
         </w:tc>
@@ -4805,7 +5662,21 @@
               <w:rPr>
                 <w:rFonts w:ascii="Calibri" w:eastAsia="Calibri" w:hAnsi="Calibri" w:cs="Calibri"/>
               </w:rPr>
-              <w:t>{%tr endfor%}</w:t>
+              <w:t xml:space="preserve">{%tr </w:t>
+            </w:r>
+            <w:proofErr w:type="spellStart"/>
+            <w:r>
+              <w:rPr>
+                <w:rFonts w:ascii="Calibri" w:eastAsia="Calibri" w:hAnsi="Calibri" w:cs="Calibri"/>
+              </w:rPr>
+              <w:t>endfor</w:t>
+            </w:r>
+            <w:proofErr w:type="spellEnd"/>
+            <w:r>
+              <w:rPr>
+                <w:rFonts w:ascii="Calibri" w:eastAsia="Calibri" w:hAnsi="Calibri" w:cs="Calibri"/>
+              </w:rPr>
+              <w:t>%}</w:t>
             </w:r>
           </w:p>
         </w:tc>
@@ -4840,8 +5711,19 @@
           <w:bCs/>
           <w:lang w:val="pt-BR"/>
         </w:rPr>
-        <w:t>Análise de Correlação Mente-Corpo: Bases da Nova Medicina Germânica e Metamedicina</w:t>
+        <w:t xml:space="preserve">Análise de Correlação Mente-Corpo: Bases da Nova Medicina Germânica e </w:t>
       </w:r>
+      <w:proofErr w:type="spellStart"/>
+      <w:r>
+        <w:rPr>
+          <w:rFonts w:ascii="Calibri" w:eastAsia="Calibri" w:hAnsi="Calibri" w:cs="Calibri"/>
+          <w:b/>
+          <w:bCs/>
+          <w:lang w:val="pt-BR"/>
+        </w:rPr>
+        <w:t>Metamedicina</w:t>
+      </w:r>
+      <w:proofErr w:type="spellEnd"/>
     </w:p>
     <w:p>
       <w:pPr>
@@ -4919,6 +5801,7 @@
         </w:rPr>
         <w:br/>
       </w:r>
+      <w:proofErr w:type="spellStart"/>
       <w:r>
         <w:rPr>
           <w:rFonts w:ascii="Calibri" w:eastAsia="Calibri" w:hAnsi="Calibri" w:cs="Calibri"/>
@@ -4926,7 +5809,17 @@
           <w:bCs/>
           <w:lang w:val="pt-BR"/>
         </w:rPr>
-        <w:t>Bienestar - Terapias Biofísicas</w:t>
+        <w:t>Bienestar</w:t>
+      </w:r>
+      <w:proofErr w:type="spellEnd"/>
+      <w:r>
+        <w:rPr>
+          <w:rFonts w:ascii="Calibri" w:eastAsia="Calibri" w:hAnsi="Calibri" w:cs="Calibri"/>
+          <w:b/>
+          <w:bCs/>
+          <w:lang w:val="pt-BR"/>
+        </w:rPr>
+        <w:t xml:space="preserve"> - Terapias Biofísicas</w:t>
       </w:r>
       <w:r>
         <w:rPr>

</xml_diff>